<commit_message>
chore: update 7 file(s)
</commit_message>
<xml_diff>
--- a/docs/market-sizing_lumina.docx
+++ b/docs/market-sizing_lumina.docx
@@ -51,7 +51,7 @@
           <w:sz w:val="20"/>
           <w:szCs w:val="20"/>
         </w:rPr>
-        <w:t xml:space="preserve">So Smart Apps LLC · July 12, 2026 · Internal — for deck and grant-application use after pricing confirmation</w:t>
+        <w:t xml:space="preserve">So Smart Apps LLC · July 12, 2026 (rev. 2 — $14.99 base case, cognition module added) · Internal</w:t>
       </w:r>
     </w:p>
     <w:p>
@@ -113,28 +113,20 @@
       <w:r>
         <w:rPr>
           <w:rFonts w:ascii="Arial" w:cs="Arial" w:eastAsia="Arial" w:hAnsi="Arial"/>
-          <w:sz w:val="22"/>
-          <w:szCs w:val="22"/>
-        </w:rPr>
-        <w:t xml:space="preserve">Two items remain for Leon: </w:t>
-      </w:r>
-      <w:r>
-        <w:rPr>
-          <w:rFonts w:ascii="Arial" w:cs="Arial" w:eastAsia="Arial" w:hAnsi="Arial"/>
           <w:b/>
           <w:bCs/>
           <w:sz w:val="22"/>
           <w:szCs w:val="22"/>
         </w:rPr>
-        <w:t xml:space="preserve">(1) confirm live pricing in RevenueCat/App Store Connect</w:t>
-      </w:r>
-      <w:r>
-        <w:rPr>
-          <w:rFonts w:ascii="Arial" w:cs="Arial" w:eastAsia="Arial" w:hAnsi="Arial"/>
-          <w:sz w:val="22"/>
-          <w:szCs w:val="22"/>
-        </w:rPr>
-        <w:t xml:space="preserve"> — the code fetches prices at runtime (product.priceString); nothing is hard-coded, so $9.99/mo remains a working assumption — and </w:t>
+        <w:t xml:space="preserve">Rev. 2 changes (same day):</w:t>
+      </w:r>
+      <w:r>
+        <w:rPr>
+          <w:rFonts w:ascii="Arial" w:cs="Arial" w:eastAsia="Arial" w:hAnsi="Arial"/>
+          <w:sz w:val="22"/>
+          <w:szCs w:val="22"/>
+        </w:rPr>
+        <w:t xml:space="preserve"> RevenueCat dashboard verified — no products configured yet, so pricing was an open decision. Based on the competitive/WTP research below, the base case is now </w:t>
       </w:r>
       <w:r>
         <w:rPr>
@@ -144,15 +136,33 @@
           <w:sz w:val="22"/>
           <w:szCs w:val="22"/>
         </w:rPr>
-        <w:t xml:space="preserve">(2) decide the TAM framing</w:t>
-      </w:r>
-      <w:r>
-        <w:rPr>
-          <w:rFonts w:ascii="Arial" w:cs="Arial" w:eastAsia="Arial" w:hAnsi="Arial"/>
-          <w:sz w:val="22"/>
-          <w:szCs w:val="22"/>
-        </w:rPr>
-        <w:t xml:space="preserve"> for the MCI extension (12.9M sourced vs. 15M with a stated assumption).</w:t>
+        <w:t xml:space="preserve">$14.99/mo with a $99/yr annual plan</w:t>
+      </w:r>
+      <w:r>
+        <w:rPr>
+          <w:rFonts w:ascii="Arial" w:cs="Arial" w:eastAsia="Arial" w:hAnsi="Arial"/>
+          <w:sz w:val="22"/>
+          <w:szCs w:val="22"/>
+        </w:rPr>
+        <w:t xml:space="preserve"> (blended ARPU ~$135/yr assumed at a 60/40 monthly/annual mix), with $9.99/$120 retained as the sensitivity floor. The model also now reflects the in-development </w:t>
+      </w:r>
+      <w:r>
+        <w:rPr>
+          <w:rFonts w:ascii="Arial" w:cs="Arial" w:eastAsia="Arial" w:hAnsi="Arial"/>
+          <w:b/>
+          <w:bCs/>
+          <w:sz w:val="22"/>
+          <w:szCs w:val="22"/>
+        </w:rPr>
+        <w:t xml:space="preserve">dementia cognition module</w:t>
+      </w:r>
+      <w:r>
+        <w:rPr>
+          <w:rFonts w:ascii="Arial" w:cs="Arial" w:eastAsia="Arial" w:hAnsi="Arial"/>
+          <w:sz w:val="22"/>
+          <w:szCs w:val="22"/>
+        </w:rPr>
+        <w:t xml:space="preserve">, which moves Lumina from two paid categories (safety + coordination) to three (+ cognition).</w:t>
       </w:r>
     </w:p>
     <w:p>
@@ -227,7 +237,7 @@
           <w:sz w:val="22"/>
           <w:szCs w:val="22"/>
         </w:rPr>
-        <w:t xml:space="preserve">: two tiers (free / premium) gate vehicle tracking, caregiver invites, medication photos, and resource caps (5 reminders, 3 medications, 1 geo-zone on free). Premium unlocks all. Prices are configured in RevenueCat / App Store Connect and fetched live; </w:t>
+        <w:t xml:space="preserve">: two tiers (free / premium) gate vehicle tracking, caregiver invites, medication photos, and resource caps (5 reminders, 3 medications, 1 geo-zone on free). Prices are fetched live from RevenueCat; </w:t>
       </w:r>
       <w:r>
         <w:rPr>
@@ -237,15 +247,74 @@
           <w:sz w:val="22"/>
           <w:szCs w:val="22"/>
         </w:rPr>
-        <w:t xml:space="preserve">$9.99/mo (~$120/yr) is the working assumption throughout</w:t>
-      </w:r>
-      <w:r>
-        <w:rPr>
-          <w:rFonts w:ascii="Arial" w:cs="Arial" w:eastAsia="Arial" w:hAnsi="Arial"/>
-          <w:sz w:val="22"/>
-          <w:szCs w:val="22"/>
-        </w:rPr>
-        <w:t xml:space="preserve"> — confirm before external use. Willingness-to-pay research (below) suggests $9.99 is below caregiver WTP medians, so the assumption is conservative rather than optimistic.</w:t>
+        <w:t xml:space="preserve">no products are configured yet</w:t>
+      </w:r>
+      <w:r>
+        <w:rPr>
+          <w:rFonts w:ascii="Arial" w:cs="Arial" w:eastAsia="Arial" w:hAnsi="Arial"/>
+          <w:sz w:val="22"/>
+          <w:szCs w:val="22"/>
+        </w:rPr>
+        <w:t xml:space="preserve"> (dashboard verified 2026-07-12), so pricing is a decision, not a constraint. A planned </w:t>
+      </w:r>
+      <w:r>
+        <w:rPr>
+          <w:rFonts w:ascii="Arial" w:cs="Arial" w:eastAsia="Arial" w:hAnsi="Arial"/>
+          <w:b/>
+          <w:bCs/>
+          <w:sz w:val="22"/>
+          <w:szCs w:val="22"/>
+        </w:rPr>
+        <w:t xml:space="preserve">cognition module</w:t>
+      </w:r>
+      <w:r>
+        <w:rPr>
+          <w:rFonts w:ascii="Arial" w:cs="Arial" w:eastAsia="Arial" w:hAnsi="Arial"/>
+          <w:sz w:val="22"/>
+          <w:szCs w:val="22"/>
+        </w:rPr>
+        <w:t xml:space="preserve"> (adaptive exercises with caregiver-visible progress; in development) adds a third paid category.</w:t>
+      </w:r>
+    </w:p>
+    <w:p>
+      <w:pPr>
+        <w:spacing w:after="120" w:line="276"/>
+      </w:pPr>
+      <w:r>
+        <w:rPr>
+          <w:rFonts w:ascii="Arial" w:cs="Arial" w:eastAsia="Arial" w:hAnsi="Arial"/>
+          <w:b/>
+          <w:bCs/>
+          <w:sz w:val="22"/>
+          <w:szCs w:val="22"/>
+        </w:rPr>
+        <w:t xml:space="preserve">Base case: $14.99/mo / $99/yr → blended ARPU ~$135/yr</w:t>
+      </w:r>
+      <w:r>
+        <w:rPr>
+          <w:rFonts w:ascii="Arial" w:cs="Arial" w:eastAsia="Arial" w:hAnsi="Arial"/>
+          <w:sz w:val="22"/>
+          <w:szCs w:val="22"/>
+        </w:rPr>
+        <w:t xml:space="preserve"> (assumes ~60% monthly / 40% annual mix). Rationale: Life360’s actual US revenue per paying family is ~$14/mo (Q1 2026 SEC filing) — the proven collection point for phone-based family safety; AngelSense collects $45–65/mo plus hardware for dementia wander-safety; and standalone cognition apps charge $12–30/mo (Lumosity $11.99, BrainHQ ~$14, Constant Therapy $29.99). Lumina bundles all three categories — “one app instead of three” ($30–55/mo bought separately). </w:t>
+      </w:r>
+      <w:r>
+        <w:rPr>
+          <w:rFonts w:ascii="Arial" w:cs="Arial" w:eastAsia="Arial" w:hAnsi="Arial"/>
+          <w:b/>
+          <w:bCs/>
+          <w:sz w:val="22"/>
+          <w:szCs w:val="22"/>
+        </w:rPr>
+        <w:t xml:space="preserve">Sensitivity floor: $9.99/$120/yr</w:t>
+      </w:r>
+      <w:r>
+        <w:rPr>
+          <w:rFonts w:ascii="Arial" w:cs="Arial" w:eastAsia="Arial" w:hAnsi="Arial"/>
+          <w:sz w:val="22"/>
+          <w:szCs w:val="22"/>
+        </w:rPr>
+        <w:t xml:space="preserve"> — all dollar figures below scale by 0.89 at the floor.</w:t>
       </w:r>
     </w:p>
     <w:p>
@@ -325,7 +394,7 @@
     </w:p>
     <w:tbl>
       <w:tblPr>
-        <w:tblW w:type="dxa" w:w="9300"/>
+        <w:tblW w:type="dxa" w:w="10800"/>
         <w:tblBorders>
           <w:top w:val="single" w:color="auto" w:sz="4"/>
           <w:left w:val="single" w:color="auto" w:sz="4"/>
@@ -337,8 +406,9 @@
       </w:tblPr>
       <w:tblGrid>
         <w:gridCol w:w="3400"/>
+        <w:gridCol w:w="2200"/>
         <w:gridCol w:w="2600"/>
-        <w:gridCol w:w="3300"/>
+        <w:gridCol w:w="2600"/>
       </w:tblGrid>
       <w:tr>
         <w:trPr>
@@ -375,7 +445,7 @@
         </w:tc>
         <w:tc>
           <w:tcPr>
-            <w:tcW w:type="dxa" w:w="2600"/>
+            <w:tcW w:type="dxa" w:w="2200"/>
             <w:shd w:fill="1B3A5C" w:color="auto" w:val="clear"/>
             <w:tcMar>
               <w:top w:type="dxa" w:w="60"/>
@@ -403,7 +473,7 @@
         </w:tc>
         <w:tc>
           <w:tcPr>
-            <w:tcW w:type="dxa" w:w="3300"/>
+            <w:tcW w:type="dxa" w:w="2600"/>
             <w:shd w:fill="1B3A5C" w:color="auto" w:val="clear"/>
             <w:tcMar>
               <w:top w:type="dxa" w:w="60"/>
@@ -425,7 +495,35 @@
                 <w:sz w:val="20"/>
                 <w:szCs w:val="20"/>
               </w:rPr>
-              <w:t xml:space="preserve">Annual value @ $120/yr</w:t>
+              <w:t xml:space="preserve">@ $135/yr (base)</w:t>
+            </w:r>
+          </w:p>
+        </w:tc>
+        <w:tc>
+          <w:tcPr>
+            <w:tcW w:type="dxa" w:w="2600"/>
+            <w:shd w:fill="1B3A5C" w:color="auto" w:val="clear"/>
+            <w:tcMar>
+              <w:top w:type="dxa" w:w="60"/>
+              <w:left w:type="dxa" w:w="100"/>
+              <w:bottom w:type="dxa" w:w="60"/>
+              <w:right w:type="dxa" w:w="100"/>
+            </w:tcMar>
+          </w:tcPr>
+          <w:p>
+            <w:pPr>
+              <w:spacing w:after="0" w:before="0" w:line="240"/>
+            </w:pPr>
+            <w:r>
+              <w:rPr>
+                <w:rFonts w:ascii="Arial" w:cs="Arial" w:eastAsia="Arial" w:hAnsi="Arial"/>
+                <w:b/>
+                <w:bCs/>
+                <w:color w:val="FFFFFF"/>
+                <w:sz w:val="20"/>
+                <w:szCs w:val="20"/>
+              </w:rPr>
+              <w:t xml:space="preserve">@ $120/yr (floor)</w:t>
             </w:r>
           </w:p>
         </w:tc>
@@ -464,7 +562,7 @@
         </w:tc>
         <w:tc>
           <w:tcPr>
-            <w:tcW w:type="dxa" w:w="2600"/>
+            <w:tcW w:type="dxa" w:w="2200"/>
             <w:tcMar>
               <w:top w:type="dxa" w:w="60"/>
               <w:left w:type="dxa" w:w="100"/>
@@ -491,7 +589,34 @@
         </w:tc>
         <w:tc>
           <w:tcPr>
-            <w:tcW w:type="dxa" w:w="3300"/>
+            <w:tcW w:type="dxa" w:w="2600"/>
+            <w:tcMar>
+              <w:top w:type="dxa" w:w="60"/>
+              <w:left w:type="dxa" w:w="100"/>
+              <w:bottom w:type="dxa" w:w="60"/>
+              <w:right w:type="dxa" w:w="100"/>
+            </w:tcMar>
+          </w:tcPr>
+          <w:p>
+            <w:pPr>
+              <w:spacing w:after="0" w:before="0" w:line="240"/>
+            </w:pPr>
+            <w:r>
+              <w:rPr>
+                <w:rFonts w:ascii="Arial" w:cs="Arial" w:eastAsia="Arial" w:hAnsi="Arial"/>
+                <w:b w:val="false"/>
+                <w:bCs w:val="false"/>
+                <w:color w:val="000000"/>
+                <w:sz w:val="20"/>
+                <w:szCs w:val="20"/>
+              </w:rPr>
+              <w:t xml:space="preserve">~$1.74B/yr</w:t>
+            </w:r>
+          </w:p>
+        </w:tc>
+        <w:tc>
+          <w:tcPr>
+            <w:tcW w:type="dxa" w:w="2600"/>
             <w:tcMar>
               <w:top w:type="dxa" w:w="60"/>
               <w:left w:type="dxa" w:w="100"/>
@@ -551,7 +676,7 @@
         </w:tc>
         <w:tc>
           <w:tcPr>
-            <w:tcW w:type="dxa" w:w="2600"/>
+            <w:tcW w:type="dxa" w:w="2200"/>
             <w:tcMar>
               <w:top w:type="dxa" w:w="60"/>
               <w:left w:type="dxa" w:w="100"/>
@@ -578,7 +703,34 @@
         </w:tc>
         <w:tc>
           <w:tcPr>
-            <w:tcW w:type="dxa" w:w="3300"/>
+            <w:tcW w:type="dxa" w:w="2600"/>
+            <w:tcMar>
+              <w:top w:type="dxa" w:w="60"/>
+              <w:left w:type="dxa" w:w="100"/>
+              <w:bottom w:type="dxa" w:w="60"/>
+              <w:right w:type="dxa" w:w="100"/>
+            </w:tcMar>
+          </w:tcPr>
+          <w:p>
+            <w:pPr>
+              <w:spacing w:after="0" w:before="0" w:line="240"/>
+            </w:pPr>
+            <w:r>
+              <w:rPr>
+                <w:rFonts w:ascii="Arial" w:cs="Arial" w:eastAsia="Arial" w:hAnsi="Arial"/>
+                <w:b w:val="false"/>
+                <w:bCs w:val="false"/>
+                <w:color w:val="000000"/>
+                <w:sz w:val="20"/>
+                <w:szCs w:val="20"/>
+              </w:rPr>
+              <w:t xml:space="preserve">~$2.0B/yr</w:t>
+            </w:r>
+          </w:p>
+        </w:tc>
+        <w:tc>
+          <w:tcPr>
+            <w:tcW w:type="dxa" w:w="2600"/>
             <w:tcMar>
               <w:top w:type="dxa" w:w="60"/>
               <w:left w:type="dxa" w:w="100"/>
@@ -616,7 +768,7 @@
           <w:sz w:val="20"/>
           <w:szCs w:val="20"/>
         </w:rPr>
-        <w:t xml:space="preserve">Recommended external phrasing: “$1.5–1.8B/yr U.S. TAM.” Third-party sanity check: elderly-monitoring market reports ($3.5B global 2023, ~10% CAGR) are directionally consistent; the bottom-up math above is the stronger defense.</w:t>
+        <w:t xml:space="preserve">Recommended external phrasing: “$1.7–2.0B/yr U.S. TAM” (floor: $1.55–1.8B). Third-party sanity check: elderly-monitoring market reports ($3.5B global 2023, ~10% CAGR) are directionally consistent; the bottom-up math above is the stronger defense.</w:t>
       </w:r>
     </w:p>
     <w:p>
@@ -1157,15 +1309,15 @@
           <w:sz w:val="22"/>
           <w:szCs w:val="22"/>
         </w:rPr>
-        <w:t xml:space="preserve">SAM: ~2.7M caregivers ≈ $324M/yr.</w:t>
-      </w:r>
-      <w:r>
-        <w:rPr>
-          <w:rFonts w:ascii="Arial" w:cs="Arial" w:eastAsia="Arial" w:hAnsi="Arial"/>
-          <w:sz w:val="22"/>
-          <w:szCs w:val="22"/>
-        </w:rPr>
-        <w:t xml:space="preserve"> Conservative floor (the draft’s original 14% filter): ~2.1M ≈ $250M/yr. Cite “$250–325M” externally; use the floor with skeptics.</w:t>
+        <w:t xml:space="preserve">SAM: ~2.7M caregivers ≈ $365M/yr at base pricing</w:t>
+      </w:r>
+      <w:r>
+        <w:rPr>
+          <w:rFonts w:ascii="Arial" w:cs="Arial" w:eastAsia="Arial" w:hAnsi="Arial"/>
+          <w:sz w:val="22"/>
+          <w:szCs w:val="22"/>
+        </w:rPr>
+        <w:t xml:space="preserve"> ($324M at the $120 floor). Conservative filter (the draft’s original 14%): ~2.1M ≈ $284M ($252M at floor). Cite “$280–365M” externally; use the floor with skeptics.</w:t>
       </w:r>
     </w:p>
     <w:p>
@@ -1201,7 +1353,7 @@
           <w:sz w:val="22"/>
           <w:szCs w:val="22"/>
         </w:rPr>
-        <w:t xml:space="preserve">A ~$10/mo pure-software subscription undercuts every dedicated wander-management product, which run $30–65/mo plus $230–450 hardware. Prices verified 2025–2026:</w:t>
+        <w:t xml:space="preserve">At $14.99/mo Lumina still undercuts every dedicated wander-management product ($30–65/mo plus $230–450 hardware) by 65–75%, while matching Life360 Gold’s proven price with dementia-specific value. Prices verified 2025–2026:</w:t>
       </w:r>
     </w:p>
     <w:tbl>
@@ -2007,7 +2159,355 @@
           </w:p>
         </w:tc>
       </w:tr>
+      <w:tr>
+        <w:trPr>
+          <w:cantSplit/>
+          <w:tblHeader w:val="false"/>
+        </w:trPr>
+        <w:tc>
+          <w:tcPr>
+            <w:tcW w:type="dxa" w:w="2800"/>
+            <w:tcMar>
+              <w:top w:type="dxa" w:w="60"/>
+              <w:left w:type="dxa" w:w="100"/>
+              <w:bottom w:type="dxa" w:w="60"/>
+              <w:right w:type="dxa" w:w="100"/>
+            </w:tcMar>
+          </w:tcPr>
+          <w:p>
+            <w:pPr>
+              <w:spacing w:after="0" w:before="0" w:line="240"/>
+            </w:pPr>
+            <w:r>
+              <w:rPr>
+                <w:rFonts w:ascii="Arial" w:cs="Arial" w:eastAsia="Arial" w:hAnsi="Arial"/>
+                <w:b w:val="false"/>
+                <w:bCs w:val="false"/>
+                <w:color w:val="000000"/>
+                <w:sz w:val="18"/>
+                <w:szCs w:val="18"/>
+              </w:rPr>
+              <w:t xml:space="preserve">Constant Therapy (cognition)</w:t>
+            </w:r>
+          </w:p>
+        </w:tc>
+        <w:tc>
+          <w:tcPr>
+            <w:tcW w:type="dxa" w:w="2300"/>
+            <w:tcMar>
+              <w:top w:type="dxa" w:w="60"/>
+              <w:left w:type="dxa" w:w="100"/>
+              <w:bottom w:type="dxa" w:w="60"/>
+              <w:right w:type="dxa" w:w="100"/>
+            </w:tcMar>
+          </w:tcPr>
+          <w:p>
+            <w:pPr>
+              <w:spacing w:after="0" w:before="0" w:line="240"/>
+            </w:pPr>
+            <w:r>
+              <w:rPr>
+                <w:rFonts w:ascii="Arial" w:cs="Arial" w:eastAsia="Arial" w:hAnsi="Arial"/>
+                <w:b w:val="false"/>
+                <w:bCs w:val="false"/>
+                <w:color w:val="000000"/>
+                <w:sz w:val="18"/>
+                <w:szCs w:val="18"/>
+              </w:rPr>
+              <w:t xml:space="preserve">—</w:t>
+            </w:r>
+          </w:p>
+        </w:tc>
+        <w:tc>
+          <w:tcPr>
+            <w:tcW w:type="dxa" w:w="4200"/>
+            <w:tcMar>
+              <w:top w:type="dxa" w:w="60"/>
+              <w:left w:type="dxa" w:w="100"/>
+              <w:bottom w:type="dxa" w:w="60"/>
+              <w:right w:type="dxa" w:w="100"/>
+            </w:tcMar>
+          </w:tcPr>
+          <w:p>
+            <w:pPr>
+              <w:spacing w:after="0" w:before="0" w:line="240"/>
+            </w:pPr>
+            <w:r>
+              <w:rPr>
+                <w:rFonts w:ascii="Arial" w:cs="Arial" w:eastAsia="Arial" w:hAnsi="Arial"/>
+                <w:b w:val="false"/>
+                <w:bCs w:val="false"/>
+                <w:color w:val="000000"/>
+                <w:sz w:val="18"/>
+                <w:szCs w:val="18"/>
+              </w:rPr>
+              <w:t xml:space="preserve">$29.99 ($299.99/yr) — clinical speech/cognitive therapy incl. dementia</w:t>
+            </w:r>
+          </w:p>
+        </w:tc>
+      </w:tr>
+      <w:tr>
+        <w:trPr>
+          <w:cantSplit/>
+          <w:tblHeader w:val="false"/>
+        </w:trPr>
+        <w:tc>
+          <w:tcPr>
+            <w:tcW w:type="dxa" w:w="2800"/>
+            <w:tcMar>
+              <w:top w:type="dxa" w:w="60"/>
+              <w:left w:type="dxa" w:w="100"/>
+              <w:bottom w:type="dxa" w:w="60"/>
+              <w:right w:type="dxa" w:w="100"/>
+            </w:tcMar>
+          </w:tcPr>
+          <w:p>
+            <w:pPr>
+              <w:spacing w:after="0" w:before="0" w:line="240"/>
+            </w:pPr>
+            <w:r>
+              <w:rPr>
+                <w:rFonts w:ascii="Arial" w:cs="Arial" w:eastAsia="Arial" w:hAnsi="Arial"/>
+                <w:b w:val="false"/>
+                <w:bCs w:val="false"/>
+                <w:color w:val="000000"/>
+                <w:sz w:val="18"/>
+                <w:szCs w:val="18"/>
+              </w:rPr>
+              <w:t xml:space="preserve">BrainHQ (cognition)</w:t>
+            </w:r>
+          </w:p>
+        </w:tc>
+        <w:tc>
+          <w:tcPr>
+            <w:tcW w:type="dxa" w:w="2300"/>
+            <w:tcMar>
+              <w:top w:type="dxa" w:w="60"/>
+              <w:left w:type="dxa" w:w="100"/>
+              <w:bottom w:type="dxa" w:w="60"/>
+              <w:right w:type="dxa" w:w="100"/>
+            </w:tcMar>
+          </w:tcPr>
+          <w:p>
+            <w:pPr>
+              <w:spacing w:after="0" w:before="0" w:line="240"/>
+            </w:pPr>
+            <w:r>
+              <w:rPr>
+                <w:rFonts w:ascii="Arial" w:cs="Arial" w:eastAsia="Arial" w:hAnsi="Arial"/>
+                <w:b w:val="false"/>
+                <w:bCs w:val="false"/>
+                <w:color w:val="000000"/>
+                <w:sz w:val="18"/>
+                <w:szCs w:val="18"/>
+              </w:rPr>
+              <w:t xml:space="preserve">—</w:t>
+            </w:r>
+          </w:p>
+        </w:tc>
+        <w:tc>
+          <w:tcPr>
+            <w:tcW w:type="dxa" w:w="4200"/>
+            <w:tcMar>
+              <w:top w:type="dxa" w:w="60"/>
+              <w:left w:type="dxa" w:w="100"/>
+              <w:bottom w:type="dxa" w:w="60"/>
+              <w:right w:type="dxa" w:w="100"/>
+            </w:tcMar>
+          </w:tcPr>
+          <w:p>
+            <w:pPr>
+              <w:spacing w:after="0" w:before="0" w:line="240"/>
+            </w:pPr>
+            <w:r>
+              <w:rPr>
+                <w:rFonts w:ascii="Arial" w:cs="Arial" w:eastAsia="Arial" w:hAnsi="Arial"/>
+                <w:b w:val="false"/>
+                <w:bCs w:val="false"/>
+                <w:color w:val="000000"/>
+                <w:sz w:val="18"/>
+                <w:szCs w:val="18"/>
+              </w:rPr>
+              <w:t xml:space="preserve">~$14 (~$96/yr)</w:t>
+            </w:r>
+          </w:p>
+        </w:tc>
+      </w:tr>
+      <w:tr>
+        <w:trPr>
+          <w:cantSplit/>
+          <w:tblHeader w:val="false"/>
+        </w:trPr>
+        <w:tc>
+          <w:tcPr>
+            <w:tcW w:type="dxa" w:w="2800"/>
+            <w:tcMar>
+              <w:top w:type="dxa" w:w="60"/>
+              <w:left w:type="dxa" w:w="100"/>
+              <w:bottom w:type="dxa" w:w="60"/>
+              <w:right w:type="dxa" w:w="100"/>
+            </w:tcMar>
+          </w:tcPr>
+          <w:p>
+            <w:pPr>
+              <w:spacing w:after="0" w:before="0" w:line="240"/>
+            </w:pPr>
+            <w:r>
+              <w:rPr>
+                <w:rFonts w:ascii="Arial" w:cs="Arial" w:eastAsia="Arial" w:hAnsi="Arial"/>
+                <w:b w:val="false"/>
+                <w:bCs w:val="false"/>
+                <w:color w:val="000000"/>
+                <w:sz w:val="18"/>
+                <w:szCs w:val="18"/>
+              </w:rPr>
+              <w:t xml:space="preserve">Lumosity (cognition)</w:t>
+            </w:r>
+          </w:p>
+        </w:tc>
+        <w:tc>
+          <w:tcPr>
+            <w:tcW w:type="dxa" w:w="2300"/>
+            <w:tcMar>
+              <w:top w:type="dxa" w:w="60"/>
+              <w:left w:type="dxa" w:w="100"/>
+              <w:bottom w:type="dxa" w:w="60"/>
+              <w:right w:type="dxa" w:w="100"/>
+            </w:tcMar>
+          </w:tcPr>
+          <w:p>
+            <w:pPr>
+              <w:spacing w:after="0" w:before="0" w:line="240"/>
+            </w:pPr>
+            <w:r>
+              <w:rPr>
+                <w:rFonts w:ascii="Arial" w:cs="Arial" w:eastAsia="Arial" w:hAnsi="Arial"/>
+                <w:b w:val="false"/>
+                <w:bCs w:val="false"/>
+                <w:color w:val="000000"/>
+                <w:sz w:val="18"/>
+                <w:szCs w:val="18"/>
+              </w:rPr>
+              <w:t xml:space="preserve">—</w:t>
+            </w:r>
+          </w:p>
+        </w:tc>
+        <w:tc>
+          <w:tcPr>
+            <w:tcW w:type="dxa" w:w="4200"/>
+            <w:tcMar>
+              <w:top w:type="dxa" w:w="60"/>
+              <w:left w:type="dxa" w:w="100"/>
+              <w:bottom w:type="dxa" w:w="60"/>
+              <w:right w:type="dxa" w:w="100"/>
+            </w:tcMar>
+          </w:tcPr>
+          <w:p>
+            <w:pPr>
+              <w:spacing w:after="0" w:before="0" w:line="240"/>
+            </w:pPr>
+            <w:r>
+              <w:rPr>
+                <w:rFonts w:ascii="Arial" w:cs="Arial" w:eastAsia="Arial" w:hAnsi="Arial"/>
+                <w:b w:val="false"/>
+                <w:bCs w:val="false"/>
+                <w:color w:val="000000"/>
+                <w:sz w:val="18"/>
+                <w:szCs w:val="18"/>
+              </w:rPr>
+              <w:t xml:space="preserve">$11.99 ($59.99/yr — recently cut ~50%; category commoditizing)</w:t>
+            </w:r>
+          </w:p>
+        </w:tc>
+      </w:tr>
     </w:tbl>
+    <w:p>
+      <w:pPr>
+        <w:pStyle w:val="Heading2"/>
+        <w:keepNext/>
+        <w:spacing w:after="100" w:before="240"/>
+      </w:pPr>
+      <w:r>
+        <w:rPr>
+          <w:rFonts w:ascii="Arial" w:cs="Arial" w:eastAsia="Arial" w:hAnsi="Arial"/>
+          <w:b/>
+          <w:bCs/>
+          <w:color w:val="1B3A5C"/>
+          <w:sz w:val="26"/>
+          <w:szCs w:val="26"/>
+        </w:rPr>
+        <w:t xml:space="preserve">Pricing recommendation</w:t>
+      </w:r>
+    </w:p>
+    <w:p>
+      <w:pPr>
+        <w:spacing w:after="120" w:line="276"/>
+      </w:pPr>
+      <w:r>
+        <w:rPr>
+          <w:rFonts w:ascii="Arial" w:cs="Arial" w:eastAsia="Arial" w:hAnsi="Arial"/>
+          <w:b/>
+          <w:bCs/>
+          <w:sz w:val="22"/>
+          <w:szCs w:val="22"/>
+        </w:rPr>
+        <w:t xml:space="preserve">Launch at $14.99/mo with a $99/yr annual plan.</w:t>
+      </w:r>
+      <w:r>
+        <w:rPr>
+          <w:rFonts w:ascii="Arial" w:cs="Arial" w:eastAsia="Arial" w:hAnsi="Arial"/>
+          <w:sz w:val="22"/>
+          <w:szCs w:val="22"/>
+        </w:rPr>
+        <w:t xml:space="preserve"> Evidence brackets: Life360’s actual US ARPPC is ~$14/mo (Q1 2026 SEC filing) — the proven collection point for phone-based family safety — while AngelSense collects $44.99–64.99/mo plus hardware for credible dementia wander-safety. Lumina bundles safety + coordination + cognition, three categories bought separately for $30–55/mo; software-only competitors with dementia features do not exist (the category graveyard: CareZone, Alexa Together, Comfort Zone/AlzNav — the Alzheimer’s Association exited tracking entirely). $9.99 would position Lumina as a generic tracking app.</w:t>
+      </w:r>
+    </w:p>
+    <w:p>
+      <w:pPr>
+        <w:spacing w:after="120" w:line="276"/>
+      </w:pPr>
+      <w:r>
+        <w:rPr>
+          <w:rFonts w:ascii="Arial" w:cs="Arial" w:eastAsia="Arial" w:hAnsi="Arial"/>
+          <w:b/>
+          <w:bCs/>
+          <w:sz w:val="22"/>
+          <w:szCs w:val="22"/>
+        </w:rPr>
+        <w:t xml:space="preserve">Paywall placement: gate safety, never coordination.</w:t>
+      </w:r>
+      <w:r>
+        <w:rPr>
+          <w:rFonts w:ascii="Arial" w:cs="Arial" w:eastAsia="Arial" w:hAnsi="Arial"/>
+          <w:sz w:val="22"/>
+          <w:szCs w:val="22"/>
+        </w:rPr>
+        <w:t xml:space="preserve"> Free coordination substitutes (Ianacare, Lotsa Helping Hands, CaringBridge) make inviting caregivers or shared calendars unchargeable — Caring Village charges $14.99–24.99 for coordination-only and has negligible adoption. Keep geofences (beyond 1), vehicle tracking, escalation, flyer generation, and cognition-progress reporting behind premium. Later: a $24.99 multi-patient/family tier (maps to Life360 Platinum) and RevenueCat price experiments toward $19.99 once conversion data exists.</w:t>
+      </w:r>
+    </w:p>
+    <w:p>
+      <w:pPr>
+        <w:spacing w:after="120" w:line="276"/>
+      </w:pPr>
+      <w:r>
+        <w:rPr>
+          <w:rFonts w:ascii="Arial" w:cs="Arial" w:eastAsia="Arial" w:hAnsi="Arial"/>
+          <w:b/>
+          <w:bCs/>
+          <w:sz w:val="22"/>
+          <w:szCs w:val="22"/>
+        </w:rPr>
+        <w:t xml:space="preserve">Cognition-claims caution:</w:t>
+      </w:r>
+      <w:r>
+        <w:rPr>
+          <w:rFonts w:ascii="Arial" w:cs="Arial" w:eastAsia="Arial" w:hAnsi="Arial"/>
+          <w:sz w:val="22"/>
+          <w:szCs w:val="22"/>
+        </w:rPr>
+        <w:t xml:space="preserve"> market it as engagement/routine support, not “slows decline” — the FTC fined Lumosity $2M over such claims — and keep the module on the wellness side of the FDA line. Upside: a measurable cognition module materially strengthens the NIA STTR narrative.</w:t>
+      </w:r>
+    </w:p>
     <w:p>
       <w:r>
         <w:br w:type="page"/>
@@ -2227,7 +2727,7 @@
                 <w:sz w:val="20"/>
                 <w:szCs w:val="20"/>
               </w:rPr>
-              <w:t xml:space="preserve">500 paying → ~$60K ARR</w:t>
+              <w:t xml:space="preserve">500 paying → ~$68K ARR</w:t>
             </w:r>
           </w:p>
         </w:tc>
@@ -2254,7 +2754,7 @@
                 <w:sz w:val="20"/>
                 <w:szCs w:val="20"/>
               </w:rPr>
-              <w:t xml:space="preserve">2,000 → ~$240K ARR</w:t>
+              <w:t xml:space="preserve">2,000 → ~$270K ARR</w:t>
             </w:r>
           </w:p>
         </w:tc>
@@ -2314,7 +2814,7 @@
                 <w:sz w:val="20"/>
                 <w:szCs w:val="20"/>
               </w:rPr>
-              <w:t xml:space="preserve">3,000 → ~$360K ARR</w:t>
+              <w:t xml:space="preserve">3,000 → ~$405K ARR</w:t>
             </w:r>
           </w:p>
         </w:tc>
@@ -2341,7 +2841,7 @@
                 <w:sz w:val="20"/>
                 <w:szCs w:val="20"/>
               </w:rPr>
-              <w:t xml:space="preserve">8,000 → ~$960K ARR</w:t>
+              <w:t xml:space="preserve">8,000 → ~$1.08M ARR</w:t>
             </w:r>
           </w:p>
         </w:tc>
@@ -2401,7 +2901,7 @@
                 <w:sz w:val="20"/>
                 <w:szCs w:val="20"/>
               </w:rPr>
-              <w:t xml:space="preserve">8,000 → ~$960K ARR</w:t>
+              <w:t xml:space="preserve">8,000 → ~$1.08M ARR</w:t>
             </w:r>
           </w:p>
         </w:tc>
@@ -2428,7 +2928,7 @@
                 <w:sz w:val="20"/>
                 <w:szCs w:val="20"/>
               </w:rPr>
-              <w:t xml:space="preserve">18,000 → ~$2.16M ARR</w:t>
+              <w:t xml:space="preserve">18,000 → ~$2.43M ARR</w:t>
             </w:r>
           </w:p>
         </w:tc>
@@ -2444,7 +2944,7 @@
           <w:sz w:val="22"/>
           <w:szCs w:val="22"/>
         </w:rPr>
-        <w:t xml:space="preserve">Y3 stretch = </w:t>
+        <w:t xml:space="preserve">ARR at $135/yr blended ARPU (multiply by 0.89 for the $120 floor). Y3 stretch = </w:t>
       </w:r>
       <w:r>
         <w:rPr>
@@ -2462,7 +2962,12 @@
           <w:sz w:val="22"/>
           <w:szCs w:val="22"/>
         </w:rPr>
-        <w:t xml:space="preserve"> (was ~1% under the old SAM); Y3 conservative = 0.3%. Sub-1% penetration targets are the defensible numbers for skeptics.</w:t>
+        <w:t xml:space="preserve">; Y3 conservative = 0.3%. Sub-1% penetration targets are the defensible numbers for skeptics. Net of Apple’s 15% Small Business Program cut, Y3 conservative ≈ $918K (~$105/hr run-rate).</w:t>
+      </w:r>
+    </w:p>
+    <w:p>
+      <w:r>
+        <w:br w:type="page"/>
       </w:r>
     </w:p>
     <w:p>
@@ -3469,15 +3974,15 @@
           <w:sz w:val="22"/>
           <w:szCs w:val="22"/>
         </w:rPr>
-        <w:t xml:space="preserve">1. Pricing (Leon).</w:t>
-      </w:r>
-      <w:r>
-        <w:rPr>
-          <w:rFonts w:ascii="Arial" w:cs="Arial" w:eastAsia="Arial" w:hAnsi="Arial"/>
-          <w:sz w:val="22"/>
-          <w:szCs w:val="22"/>
-        </w:rPr>
-        <w:t xml:space="preserve"> Confirm the live premium price in RevenueCat / App Store Connect. Every dollar figure here scales linearly with it.</w:t>
+        <w:t xml:space="preserve">1. Store setup (Leon).</w:t>
+      </w:r>
+      <w:r>
+        <w:rPr>
+          <w:rFonts w:ascii="Arial" w:cs="Arial" w:eastAsia="Arial" w:hAnsi="Arial"/>
+          <w:sz w:val="22"/>
+          <w:szCs w:val="22"/>
+        </w:rPr>
+        <w:t xml:space="preserve"> Create the auto-renewable subscriptions in App Store Connect ($14.99/mo, $99/yr), import into RevenueCat, attach to the “premium” entitlement and default offering. RevenueCat currently has zero products (verified 2026-07-12).</w:t>
       </w:r>
     </w:p>
     <w:p>
@@ -3500,7 +4005,7 @@
           <w:sz w:val="22"/>
           <w:szCs w:val="22"/>
         </w:rPr>
-        <w:t xml:space="preserve"> Choose: cite 12.9M sourced ($1.55B) alone, or 15M with the labeled MCI assumption ($1.8B). Recommendation: lead with the sourced number, footnote the extension.</w:t>
+        <w:t xml:space="preserve"> Choose: cite 12.9M sourced ($1.74B) alone, or 15M with the labeled MCI assumption ($2.0B). Recommendation: lead with the sourced number, footnote the extension.</w:t>
       </w:r>
     </w:p>
     <w:p>
@@ -3515,15 +4020,38 @@
           <w:sz w:val="22"/>
           <w:szCs w:val="22"/>
         </w:rPr>
-        <w:t xml:space="preserve">3. Life360 tier prices</w:t>
-      </w:r>
-      <w:r>
-        <w:rPr>
-          <w:rFonts w:ascii="Arial" w:cs="Arial" w:eastAsia="Arial" w:hAnsi="Arial"/>
-          <w:sz w:val="22"/>
-          <w:szCs w:val="22"/>
-        </w:rPr>
-        <w:t xml:space="preserve"> are as-of-2024 on the current public page — re-verify if quoted directly.</w:t>
+        <w:t xml:space="preserve">3. Cognition module scope.</w:t>
+      </w:r>
+      <w:r>
+        <w:rPr>
+          <w:rFonts w:ascii="Arial" w:cs="Arial" w:eastAsia="Arial" w:hAnsi="Arial"/>
+          <w:sz w:val="22"/>
+          <w:szCs w:val="22"/>
+        </w:rPr>
+        <w:t xml:space="preserve"> The $14.99 case assumes a substantive module (adaptive, caregiver-visible progress). If it ships as a light game pack, hold the $9.99 floor instead.</w:t>
+      </w:r>
+    </w:p>
+    <w:p>
+      <w:pPr>
+        <w:spacing w:after="120" w:line="276"/>
+      </w:pPr>
+      <w:r>
+        <w:rPr>
+          <w:rFonts w:ascii="Arial" w:cs="Arial" w:eastAsia="Arial" w:hAnsi="Arial"/>
+          <w:b/>
+          <w:bCs/>
+          <w:sz w:val="22"/>
+          <w:szCs w:val="22"/>
+        </w:rPr>
+        <w:t xml:space="preserve">4. Blended-ARPU mix.</w:t>
+      </w:r>
+      <w:r>
+        <w:rPr>
+          <w:rFonts w:ascii="Arial" w:cs="Arial" w:eastAsia="Arial" w:hAnsi="Arial"/>
+          <w:sz w:val="22"/>
+          <w:szCs w:val="22"/>
+        </w:rPr>
+        <w:t xml:space="preserve"> $135/yr assumes ~60/40 monthly/annual; revisit once real conversion data exists. Life360 tier prices are as-of-2024 on the current public page — re-verify if quoted directly.</w:t>
       </w:r>
     </w:p>
     <w:p>
@@ -3676,6 +4204,62 @@
           <w:szCs w:val="18"/>
         </w:rPr>
         <w:t xml:space="preserve">•  Competitor pricing: angelsense.com/pricing; theoracare.com/theora-connect; metalert.shop (GPS SmartSole); shop.carepredict.com; life360.com/plans-pricing; apple.com/shop/buy-airtag/airtag; bouncie.com/pricing</w:t>
+      </w:r>
+    </w:p>
+    <w:p>
+      <w:pPr>
+        <w:spacing w:after="60" w:line="240"/>
+      </w:pPr>
+      <w:r>
+        <w:rPr>
+          <w:rFonts w:ascii="Arial" w:cs="Arial" w:eastAsia="Arial" w:hAnsi="Arial"/>
+          <w:color w:val="666666"/>
+          <w:sz w:val="18"/>
+          <w:szCs w:val="18"/>
+        </w:rPr>
+        <w:t xml:space="preserve">•  Life360 US ARPPC ~$167/yr (Q1 2026 8-K) — sec.gov/Archives/edgar/data/0001581760/000158176026000079/a991-life360incq126media.htm</w:t>
+      </w:r>
+    </w:p>
+    <w:p>
+      <w:pPr>
+        <w:spacing w:after="60" w:line="240"/>
+      </w:pPr>
+      <w:r>
+        <w:rPr>
+          <w:rFonts w:ascii="Arial" w:cs="Arial" w:eastAsia="Arial" w:hAnsi="Arial"/>
+          <w:color w:val="666666"/>
+          <w:sz w:val="18"/>
+          <w:szCs w:val="18"/>
+        </w:rPr>
+        <w:t xml:space="preserve">•  Cognition comps: constanttherapyhealth.com/constant-therapy/for-patients/pricing ($29.99/mo); help.lumosity.com ($11.99/mo, $59.99/yr); BrainHQ ~$14/mo (brightyears.app/blog/brainhq-pricing-2026)</w:t>
+      </w:r>
+    </w:p>
+    <w:p>
+      <w:pPr>
+        <w:spacing w:after="60" w:line="240"/>
+      </w:pPr>
+      <w:r>
+        <w:rPr>
+          <w:rFonts w:ascii="Arial" w:cs="Arial" w:eastAsia="Arial" w:hAnsi="Arial"/>
+          <w:color w:val="666666"/>
+          <w:sz w:val="18"/>
+          <w:szCs w:val="18"/>
+        </w:rPr>
+        <w:t xml:space="preserve">•  Category pricing norms: RevenueCat State of Subscription Apps 2025 — revenuecat.com/state-of-subscription-apps-2025; FTC v. Lumos Labs (2016, $2M) — ftc.gov</w:t>
+      </w:r>
+    </w:p>
+    <w:p>
+      <w:pPr>
+        <w:spacing w:after="60" w:line="240"/>
+      </w:pPr>
+      <w:r>
+        <w:rPr>
+          <w:rFonts w:ascii="Arial" w:cs="Arial" w:eastAsia="Arial" w:hAnsi="Arial"/>
+          <w:color w:val="666666"/>
+          <w:sz w:val="18"/>
+          <w:szCs w:val="18"/>
+        </w:rPr>
+        <w:t xml:space="preserve">•  Coordination-free substitutes: ianacare.com; lotsahelpinghands.com; caringbridge.org; caringvillage.com/pricing; graveyard: CareZone (Walmart 2020 sunset), Alexa Together (retired), Comfort Zone/AlzNav (discontinued)</w:t>
       </w:r>
     </w:p>
     <w:p>

</xml_diff>